<commit_message>
Erasmo Carlos: revisão da Parte 5
Co-Authored-By: Claude Opus 5.5 <noreply@anthropic.com>
Claude-Session: https://claude.ai/code/session_01MJjUEEZrxQDEUifKK2vj9g
</commit_message>
<xml_diff>
--- a/roteiros/erasmo-carlos/Erasmo_Parte5.docx
+++ b/roteiros/erasmo-carlos/Erasmo_Parte5.docx
@@ -23,7 +23,7 @@
         <w:rPr>
           <w:color w:val="000000"/>
         </w:rPr>
-        <w:t>Erasmo voltou a gravar com força. Ganhou o respeito de artistas mais novos, que cresceram ouvindo as músicas dele. Virou uma espécie de avô do rock brasileiro.</w:t>
+        <w:t>Erasmo continuou gravando e ganhou o respeito de artistas mais novos, que cresceram ouvindo as músicas dele.</w:t>
       </w:r>
     </w:p>
     <w:p>
@@ -71,7 +71,7 @@
         <w:rPr>
           <w:color w:val="000000"/>
         </w:rPr>
-        <w:t>No livro, contou histórias da infância, de Tim Maia, de Roberto, do Rock in Rio. Muitas delas com humor.</w:t>
+        <w:t>No livro, contou histórias da Jovem Guarda e do Rock in Rio, muitas delas com humor.</w:t>
       </w:r>
     </w:p>
     <w:p>
@@ -87,7 +87,7 @@
         <w:rPr>
           <w:color w:val="000000"/>
         </w:rPr>
-        <w:t>Dois anos depois, em outubro de dois mil e onze, Erasmo fez uma coisa que muita gente achava que ele nunca faria. Voltou ao Rock in Rio.</w:t>
+        <w:t>Dois anos depois, em outubro de dois mil e onze, Erasmo voltou a um lugar de onde não guardava boas lembranças. O Rock in Rio.</w:t>
       </w:r>
     </w:p>
     <w:p>
@@ -95,7 +95,7 @@
         <w:rPr>
           <w:color w:val="000000"/>
         </w:rPr>
-        <w:t>Vinte e seis anos depois das latas e das vaias, ele subiu de novo ao palco do festival, ao lado do cantor Arnaldo Antunes. Antes do show, disse aos jornalistas que não guardava boas lembranças de mil novecentos e oitenta e cinco. E que esperava, daquela vez, que o público retribuísse o carinho.</w:t>
+        <w:t>Vinte e seis anos depois das latas e das vaias, ele subiu de novo ao palco do festival, ao lado do cantor Arnaldo Antunes. Antes do show, falou aos jornalistas sobre a noite de mil novecentos e oitenta e cinco. E disse que esperava, daquela vez, que o público retribuísse o carinho.</w:t>
       </w:r>
     </w:p>
     <w:p>
@@ -319,7 +319,7 @@
         <w:rPr>
           <w:color w:val="000000"/>
         </w:rPr>
-        <w:t>Erasmo se despediu do primogênito, o menino que ele tinha prometido nunca deixar esperando por um pai.</w:t>
+        <w:t>Erasmo se despediu do primogênito, o menino que nunca precisou esperar por um pai na porta de casa.</w:t>
       </w:r>
     </w:p>
     <w:p>
@@ -351,7 +351,7 @@
         <w:rPr>
           <w:color w:val="000000"/>
         </w:rPr>
-        <w:t>Um detalhe pequeno, que um pai tinha visto e não conseguiu mudar.</w:t>
+        <w:t>Um detalhe pequeno que, para aquele pai, fez toda a diferença.</w:t>
       </w:r>
     </w:p>
     <w:p>

</xml_diff>